<commit_message>
Ch25 round 2: how Chan ended; the sealed place kept in Otto's head; similes and aphorisms trimmed
Co-Authored-By: Claude Opus 5.5 <noreply@anthropic.com>
</commit_message>
<xml_diff>
--- a/claude-notes/manuscript-v2/25-the-last-guard-merged.docx
+++ b/claude-notes/manuscript-v2/25-the-last-guard-merged.docx
@@ -53,7 +53,7 @@
           <w:i w:val="0"/>
           <w:strike w:val="0"/>
         </w:rPr>
-        <w:t>Ben had come home from the city with graphite ground into both knees and a message, delivered from the end of Otto's bed like a boy reading off a ration slip. He'd told the commander up there the old man's name, Chan, and the rest: a back-row shed, the breath, a butterfly nobody could explain. The commander hadn't said anything for so long that Ben had started counting the lamps. Then he'd asked if he could meet Otto.</w:t>
+        <w:t>Ben had come home from the city with graphite ground into both knees and a message, delivered from the end of Otto's bed without once looking up. He'd told the commander up there the old man's name, Chan, and the rest: a back-row shed, the breath, a butterfly nobody could explain. The commander hadn't said anything for so long that Ben had started counting the lamps. Then he'd asked if he could meet Otto.</w:t>
       </w:r>
     </w:p>
     <w:p>
@@ -83,7 +83,7 @@
           <w:i w:val="0"/>
           <w:strike w:val="0"/>
         </w:rPr>
-        <w:t>Gage said nothing. He'd said nothing about it for a whole day, which was how Gage argued.</w:t>
+        <w:t>Gage said nothing. He'd said nothing about it all afternoon, right through the last rehearsal, which was how Gage argued.</w:t>
       </w:r>
     </w:p>
     <w:p>
@@ -399,7 +399,7 @@
           <w:i w:val="0"/>
           <w:strike w:val="0"/>
         </w:rPr>
-        <w:t>He started at the feet, then the knees, then the hands, without hurry, a man reading a gauge he didn't trust. The old man in the shed had looked at him like that the day he'd limped in with five stitches in his scalp, past the boy to whatever lay underneath, in case there was a floor down there worth standing on.</w:t>
+        <w:t>He started at the feet, then the knees, then the hands, without hurry. The old man in the shed had looked at him like that the day he'd limped in with five stitches in his scalp, past the boy to whatever lay underneath, in case there was a floor down there worth standing on.</w:t>
       </w:r>
     </w:p>
     <w:p>
@@ -653,7 +653,7 @@
           <w:i w:val="0"/>
           <w:strike w:val="0"/>
         </w:rPr>
-        <w:t>"After the six days," Vayun said, "this house kept a post at the boundary."</w:t>
+        <w:t>"After the six days of the rebuilding," Vayun said, "this house kept a post at the boundary."</w:t>
       </w:r>
     </w:p>
     <w:p>
@@ -673,7 +673,45 @@
           <w:i w:val="0"/>
           <w:strike w:val="0"/>
         </w:rPr>
-        <w:t>"The one above the sealed place below. A small post. Six guards. In lean years, four." He turned his cup a quarter turn on the saucer, through the spilled tea. "They watched."</w:t>
+        <w:t>"The one above the sealed place below. A small post. Six guards. In lean years, four."</w:t>
+      </w:r>
+    </w:p>
+    <w:p>
+      <w:r>
+        <w:rPr>
+          <w:b w:val="0"/>
+          <w:i/>
+          <w:strike w:val="0"/>
+        </w:rPr>
+        <w:t>The Clean World</w:t>
+      </w:r>
+      <w:r>
+        <w:rPr>
+          <w:b w:val="0"/>
+          <w:i w:val="0"/>
+          <w:strike w:val="0"/>
+        </w:rPr>
+        <w:t>, Otto thought. Under the Junkyard, the old men used to say. He'd thought it was a story for children. He didn't say it.</w:t>
+      </w:r>
+    </w:p>
+    <w:p>
+      <w:r>
+        <w:rPr>
+          <w:b w:val="0"/>
+          <w:i w:val="0"/>
+          <w:strike w:val="0"/>
+        </w:rPr>
+        <w:t>"What's sealed?"</w:t>
+      </w:r>
+    </w:p>
+    <w:p>
+      <w:r>
+        <w:rPr>
+          <w:b w:val="0"/>
+          <w:i w:val="0"/>
+          <w:strike w:val="0"/>
+        </w:rPr>
+        <w:t>"That is not mine to tell." He turned his cup a quarter turn on the saucer, through the spilled tea. "They watched."</w:t>
       </w:r>
     </w:p>
     <w:p>
@@ -713,7 +751,7 @@
           <w:i w:val="0"/>
           <w:strike w:val="0"/>
         </w:rPr>
-        <w:t>"They named it for the war that made our founder lay the sword flat. You will have seen him by the doors, if Rohan brought you the long way."</w:t>
+        <w:t>"The post was named for the war that made our founder lay the sword flat. You will have seen him by the doors, if Rohan brought you the long way."</w:t>
       </w:r>
     </w:p>
     <w:p>
@@ -743,7 +781,7 @@
           <w:i w:val="0"/>
           <w:strike w:val="0"/>
         </w:rPr>
-        <w:t>"Years later the house dissolved it," Vayun said. "There was nothing to watch, they said, and a post that watches nothing is a cost. It was taken off the maps. Its guards were called up and given other work." He set the cup down, steadier this time. "The last guard was my student. When the post was struck he came to me and said that a thing sealed is a thing someone must stand outside of, or the seal means nothing. Then he went below, and he did not come up."</w:t>
+        <w:t>"Years later the house dissolved it," Vayun said. "There was nothing to watch, they said, and a post that watches nothing is a cost. It was taken off the maps. Its guards were called up and given other work." He set the cup down, steadier this time. "The last guard was my student. When the post was struck he came to me and said that a thing sealed is a thing someone must stand outside of, or the seal means nothing. Then he went down through the cloud, and he did not come back up."</w:t>
       </w:r>
     </w:p>
     <w:p>
@@ -773,17 +811,47 @@
           <w:i w:val="0"/>
           <w:strike w:val="0"/>
         </w:rPr>
-        <w:t>"In a shed. Behind the ration carts. Near the Junkyard." Otto heard his own voice go flat, the voice he used on soft ground. "Everyone thought he was just old."</w:t>
-      </w:r>
-    </w:p>
-    <w:p>
-      <w:r>
-        <w:rPr>
-          <w:b w:val="0"/>
-          <w:i w:val="0"/>
-          <w:strike w:val="0"/>
-        </w:rPr>
-        <w:t>"He was old. So am I. Age makes a very good disguise." Vayun's eyes moved to the dark beyond the lamp, where there was nothing to see but more mat. "I knew him as Shu. He was nineteen. He fell better than anyone I have taught before or since. He could go down on stone and get up with nothing broken but the stone's pride."</w:t>
+        <w:t>Vayun looked at the lamp. "How did he end?"</w:t>
+      </w:r>
+    </w:p>
+    <w:p>
+      <w:r>
+        <w:rPr>
+          <w:b w:val="0"/>
+          <w:i w:val="0"/>
+          <w:strike w:val="0"/>
+        </w:rPr>
+        <w:t>"He told me I'd picked him. I went home and slept. I went back in the morning and the shed was cold."</w:t>
+      </w:r>
+    </w:p>
+    <w:p>
+      <w:r>
+        <w:rPr>
+          <w:b w:val="0"/>
+          <w:i w:val="0"/>
+          <w:strike w:val="0"/>
+        </w:rPr>
+        <w:t>Vayun said nothing. His thumb went along the rubbed place on his belt, once, and stopped.</w:t>
+      </w:r>
+    </w:p>
+    <w:p>
+      <w:r>
+        <w:rPr>
+          <w:b w:val="0"/>
+          <w:i w:val="0"/>
+          <w:strike w:val="0"/>
+        </w:rPr>
+        <w:t>"That was his post," Otto said. "A shed. Behind the ration carts. Near the Junkyard." He heard his own voice go flat, the voice he used on soft ground. "Everyone thought he was just old."</w:t>
+      </w:r>
+    </w:p>
+    <w:p>
+      <w:r>
+        <w:rPr>
+          <w:b w:val="0"/>
+          <w:i w:val="0"/>
+          <w:strike w:val="0"/>
+        </w:rPr>
+        <w:t>"He was old. So am I." Vayun's eyes moved to the dark beyond the lamp, where there was nothing to see but more mat. "I knew him as Shu. He was the youngest I ever sent to a post. He fell better than anyone I have taught before or since. He could go down on stone and get up with nothing broken but the stone's pride."</w:t>
       </w:r>
     </w:p>
     <w:p>
@@ -959,7 +1027,7 @@
           <w:i w:val="0"/>
           <w:strike w:val="0"/>
         </w:rPr>
-        <w:t>Vayun didn't ask what it was. He didn't say what it was. He looked at it the way Otto had seen old women in Miner Town look at a name on a gate list, a name they had stopped expecting.</w:t>
+        <w:t>Vayun didn't ask what it was. He didn't say what it was. He looked at it a long time. Then he looked at Otto.</w:t>
       </w:r>
     </w:p>
     <w:p>
@@ -1085,7 +1153,7 @@
           <w:i w:val="0"/>
           <w:strike w:val="0"/>
         </w:rPr>
-        <w:t>"I fought. One finger." He thought about it. "The hand was mine. So's the rest."</w:t>
+        <w:t>"I fought. One finger. The hand was mine. So's the rest."</w:t>
       </w:r>
     </w:p>
     <w:p>
@@ -1115,7 +1183,7 @@
           <w:i w:val="0"/>
           <w:strike w:val="0"/>
         </w:rPr>
-        <w:t>Vayun nodded slowly, a sum come out right.</w:t>
+        <w:t>Vayun nodded slowly.</w:t>
       </w:r>
     </w:p>
     <w:p>
@@ -1135,7 +1203,7 @@
           <w:i w:val="0"/>
           <w:strike w:val="0"/>
         </w:rPr>
-        <w:t>He didn't raise his voice. It came flat and plain, a man naming the parts of a cart.</w:t>
+        <w:t>He didn't raise his voice. It came flat and plain.</w:t>
       </w:r>
     </w:p>
     <w:p>
@@ -1195,7 +1263,7 @@
           <w:i w:val="0"/>
           <w:strike w:val="0"/>
         </w:rPr>
-        <w:t>Otto thought about the stones, and the floor of the stillness, which he'd found and stood on and not come back from, because of what might be waiting at the top if he let go.</w:t>
+        <w:t>Otto thought about the blue, and how he'd stayed down in it because he was afraid of what was waiting at the top.</w:t>
       </w:r>
     </w:p>
     <w:p>
@@ -1235,7 +1303,7 @@
           <w:i w:val="0"/>
           <w:strike w:val="0"/>
         </w:rPr>
-        <w:t>It went into Otto like cold water. He knew that line. He'd been handed that line in a shed that smelled of rust and not-tea, by an old man with a lifted toe, on a night he'd wanted to hit a chair. He'd thought it was Master Chan's own. Master Chan had been handed it too. It had come down a stair and through a door and across a boundary nobody watched anymore, and here was the other end of it, drinking tea on a cushion.</w:t>
+        <w:t>It went into Otto like cold water. He knew that line. He'd been handed that line in a shed that smelled of rust and not-tea, by an old man with a lifted toe, on a night he'd wanted to hit a chair. He'd thought it was Master Chan's own. Here was the other end of it, drinking tea on a cushion.</w:t>
       </w:r>
     </w:p>
     <w:p>

</xml_diff>

<commit_message>
Ch25 round 3: 'He let me bleed for it'; Otto bites off the tank; Rohan doesn't ask; trims
Co-Authored-By: Claude Opus 5.5 <noreply@anthropic.com>
</commit_message>
<xml_diff>
--- a/claude-notes/manuscript-v2/25-the-last-guard-merged.docx
+++ b/claude-notes/manuscript-v2/25-the-last-guard-merged.docx
@@ -349,16 +349,6 @@
           <w:i w:val="0"/>
           <w:strike w:val="0"/>
         </w:rPr>
-        <w:t>He said it like Gage said things he meant to make true by hand.</w:t>
-      </w:r>
-    </w:p>
-    <w:p>
-      <w:r>
-        <w:rPr>
-          <w:b w:val="0"/>
-          <w:i w:val="0"/>
-          <w:strike w:val="0"/>
-        </w:rPr>
         <w:t>Otto smelled the tea before he saw the man. Something that wasn't tea: wet iron and a green thing dried too long, and under it a sweetness that stayed on the back of the tongue. He knew it as his hand knew the cup it came in, with a skin across the top you had to break with your lip.</w:t>
       </w:r>
     </w:p>
@@ -537,7 +527,7 @@
           <w:i w:val="0"/>
           <w:strike w:val="0"/>
         </w:rPr>
-        <w:t>Across the lamp, the old man set his cup down on its saucer. It didn't go down clean. It chattered against the rim, twice, and a little tea went over the edge and darkened the ivory at his wrist, and he left his hand on the cup after it was down, and the hand still wasn't steady.</w:t>
+        <w:t>Across the lamp, the old man set his cup down on its saucer. It didn't go down clean. It chattered against the rim, twice, and a little tea went over the edge and darkened the cuff at his wrist, and he left his hand on the cup after it was down, and the hand still wasn't steady.</w:t>
       </w:r>
     </w:p>
     <w:p>
@@ -937,7 +927,27 @@
           <w:i w:val="0"/>
           <w:strike w:val="0"/>
         </w:rPr>
-        <w:t xml:space="preserve"> He'd always heard it as a kindness. It had been a kindness and a report both, filed by a guard waiting at his post for someone to come up the road.</w:t>
+        <w:t xml:space="preserve"> He'd always heard it as a kindness.</w:t>
+      </w:r>
+    </w:p>
+    <w:p>
+      <w:r>
+        <w:rPr>
+          <w:b w:val="0"/>
+          <w:i w:val="0"/>
+          <w:strike w:val="0"/>
+        </w:rPr>
+        <w:t>"He let me bleed for it," Otto said.</w:t>
+      </w:r>
+    </w:p>
+    <w:p>
+      <w:r>
+        <w:rPr>
+          <w:b w:val="0"/>
+          <w:i w:val="0"/>
+          <w:strike w:val="0"/>
+        </w:rPr>
+        <w:t>Vayun didn't argue.</w:t>
       </w:r>
     </w:p>
     <w:p>
@@ -957,7 +967,7 @@
           <w:i w:val="0"/>
           <w:strike w:val="0"/>
         </w:rPr>
-        <w:t>"He was always going to be on watch. It was the only thing he was ever bad at stopping."</w:t>
+        <w:t>"He was always going to be on watch."</w:t>
       </w:r>
     </w:p>
     <w:p>
@@ -997,7 +1007,7 @@
           <w:i w:val="0"/>
           <w:strike w:val="0"/>
         </w:rPr>
-        <w:t>The old man closed his eyes. He kept them closed long enough that Rohan shifted at the edge of the mat, and the rib caught again.</w:t>
+        <w:t>The old man closed his eyes. He kept them closed long enough that Rohan shifted at the edge of the mat.</w:t>
       </w:r>
     </w:p>
     <w:p>
@@ -1057,7 +1067,7 @@
           <w:i w:val="0"/>
           <w:strike w:val="0"/>
         </w:rPr>
-        <w:t>At the edge of the mat, Rohan had come a step forward without seeming to notice. He stood with his split knuckle white, looking from the old man to the miner boy and back, putting it together piece by piece on a table in his head.</w:t>
+        <w:t>At the edge of the mat, Rohan had come a step forward without seeming to notice. He stood with his split knuckle white, looking from the old man to the miner boy and back. He did not ask. That was worse.</w:t>
       </w:r>
     </w:p>
     <w:p>
@@ -1077,7 +1087,7 @@
           <w:i w:val="0"/>
           <w:strike w:val="0"/>
         </w:rPr>
-        <w:t>"The house," said Vayun, "is often wrong about endings."</w:t>
+        <w:t>Vayun looked at the blue at Otto's wrist and didn't answer.</w:t>
       </w:r>
     </w:p>
     <w:p>
@@ -1097,7 +1107,7 @@
           <w:i w:val="0"/>
           <w:strike w:val="0"/>
         </w:rPr>
-        <w:t>"He came to me," Otto said. "In the blue. In the tank."</w:t>
+        <w:t>"He came to me," Otto said. "In the blue." He heard the next word coming, the one that would give an Ashoka master the tank, and bit it off.</w:t>
       </w:r>
     </w:p>
     <w:p>

</xml_diff>